<commit_message>
feat: Cambios ms judicial avance mes 3
</commit_message>
<xml_diff>
--- a/src/main/resources/CIVIL TRANSITORIO/template_auto_32.docx
+++ b/src/main/resources/CIVIL TRANSITORIO/template_auto_32.docx
@@ -294,22 +294,8 @@
         </w:rPr>
         <w:t>${section12}</w:t>
       </w:r>
-      <w:r>
-        <w:rPr>
-          <w:sz w:val="24"/>
-          <w:szCs w:val="24"/>
-          <w:lang w:val="es-PE"/>
-        </w:rPr>
-        <w:t>;</w:t>
-      </w:r>
-      <w:r>
-        <w:rPr>
-          <w:sz w:val="24"/>
-          <w:szCs w:val="24"/>
-          <w:lang w:val="es-PE"/>
-        </w:rPr>
-        <w:t xml:space="preserve"> </w:t>
-      </w:r>
+      <w:bookmarkStart w:id="0" w:name="_GoBack"/>
+      <w:bookmarkEnd w:id="0"/>
     </w:p>
     <w:p>
       <w:pPr>
@@ -527,16 +513,7 @@
           <w:sz w:val="22"/>
           <w:lang w:val="en-US"/>
         </w:rPr>
-        <w:t>$</w:t>
-      </w:r>
-      <w:r>
-        <w:rPr>
-          <w:rFonts w:ascii="Arial" w:hAnsi="Arial" w:cs="Arial"/>
-          <w:bCs/>
-          <w:sz w:val="22"/>
-          <w:lang w:val="en-US"/>
-        </w:rPr>
-        <w:t>{section19</w:t>
+        <w:t>${section19</w:t>
       </w:r>
       <w:r>
         <w:rPr>
@@ -606,16 +583,7 @@
           <w:sz w:val="22"/>
           <w:lang w:val="en-US"/>
         </w:rPr>
-        <w:t>$</w:t>
-      </w:r>
-      <w:r>
-        <w:rPr>
-          <w:rFonts w:ascii="Arial" w:hAnsi="Arial" w:cs="Arial"/>
-          <w:bCs/>
-          <w:sz w:val="22"/>
-          <w:lang w:val="en-US"/>
-        </w:rPr>
-        <w:t>{section21</w:t>
+        <w:t>${section21</w:t>
       </w:r>
       <w:r>
         <w:rPr>
@@ -645,16 +613,7 @@
           <w:sz w:val="22"/>
           <w:lang w:val="en-US"/>
         </w:rPr>
-        <w:t>$</w:t>
-      </w:r>
-      <w:r>
-        <w:rPr>
-          <w:rFonts w:ascii="Arial" w:hAnsi="Arial" w:cs="Arial"/>
-          <w:bCs/>
-          <w:sz w:val="22"/>
-          <w:lang w:val="en-US"/>
-        </w:rPr>
-        <w:t>{section22</w:t>
+        <w:t>${section22</w:t>
       </w:r>
       <w:r>
         <w:rPr>
@@ -726,6 +685,50 @@
           <w:szCs w:val="24"/>
           <w:lang w:val="es-PE"/>
         </w:rPr>
+        <w:t>${section24}</w:t>
+      </w:r>
+      <w:r>
+        <w:rPr>
+          <w:sz w:val="24"/>
+          <w:szCs w:val="24"/>
+          <w:lang w:val="es-PE"/>
+        </w:rPr>
+        <w:t xml:space="preserve"> </w:t>
+      </w:r>
+      <w:r>
+        <w:rPr>
+          <w:rFonts w:ascii="Arial" w:hAnsi="Arial" w:cs="Arial"/>
+          <w:bCs/>
+          <w:sz w:val="22"/>
+          <w:lang w:val="en-US"/>
+        </w:rPr>
+        <w:t>${section25</w:t>
+      </w:r>
+      <w:r>
+        <w:rPr>
+          <w:rFonts w:ascii="Arial" w:hAnsi="Arial" w:cs="Arial"/>
+          <w:bCs/>
+          <w:sz w:val="22"/>
+          <w:lang w:val="en-US"/>
+        </w:rPr>
+        <w:t>}</w:t>
+      </w:r>
+      <w:r>
+        <w:rPr>
+          <w:sz w:val="24"/>
+          <w:szCs w:val="24"/>
+          <w:lang w:val="es-PE"/>
+        </w:rPr>
+        <w:t xml:space="preserve"> </w:t>
+      </w:r>
+      <w:r>
+        <w:rPr>
+          <w:rFonts w:ascii="Arial" w:hAnsi="Arial" w:cs="Arial"/>
+          <w:b/>
+          <w:sz w:val="22"/>
+          <w:szCs w:val="24"/>
+          <w:lang w:val="es-PE"/>
+        </w:rPr>
         <w:t>${</w:t>
       </w:r>
       <w:r>
@@ -736,7 +739,7 @@
           <w:szCs w:val="24"/>
           <w:lang w:val="es-PE"/>
         </w:rPr>
-        <w:t>section24</w:t>
+        <w:t>section26</w:t>
       </w:r>
       <w:r>
         <w:rPr>
@@ -750,7 +753,9 @@
       </w:r>
       <w:r>
         <w:rPr>
-          <w:sz w:val="24"/>
+          <w:rFonts w:ascii="Arial" w:hAnsi="Arial" w:cs="Arial"/>
+          <w:b/>
+          <w:sz w:val="22"/>
           <w:szCs w:val="24"/>
           <w:lang w:val="es-PE"/>
         </w:rPr>
@@ -763,16 +768,7 @@
           <w:sz w:val="22"/>
           <w:lang w:val="en-US"/>
         </w:rPr>
-        <w:t>${section2</w:t>
-      </w:r>
-      <w:r>
-        <w:rPr>
-          <w:rFonts w:ascii="Arial" w:hAnsi="Arial" w:cs="Arial"/>
-          <w:bCs/>
-          <w:sz w:val="22"/>
-          <w:lang w:val="en-US"/>
-        </w:rPr>
-        <w:t>5</w:t>
+        <w:t>${section27</w:t>
       </w:r>
       <w:r>
         <w:rPr>
@@ -797,6 +793,7 @@
           <w:b/>
           <w:sz w:val="22"/>
           <w:szCs w:val="24"/>
+          <w:u w:val="single"/>
           <w:lang w:val="es-PE"/>
         </w:rPr>
         <w:t>${</w:t>
@@ -807,89 +804,11 @@
           <w:b/>
           <w:sz w:val="22"/>
           <w:szCs w:val="24"/>
-          <w:lang w:val="es-PE"/>
-        </w:rPr>
-        <w:t>section26</w:t>
-      </w:r>
-      <w:r>
-        <w:rPr>
-          <w:rFonts w:ascii="Arial" w:hAnsi="Arial" w:cs="Arial"/>
-          <w:b/>
-          <w:sz w:val="22"/>
-          <w:szCs w:val="24"/>
-          <w:lang w:val="es-PE"/>
-        </w:rPr>
-        <w:t>}</w:t>
-      </w:r>
-      <w:r>
-        <w:rPr>
-          <w:rFonts w:ascii="Arial" w:hAnsi="Arial" w:cs="Arial"/>
-          <w:b/>
-          <w:sz w:val="22"/>
-          <w:szCs w:val="24"/>
-          <w:lang w:val="es-PE"/>
-        </w:rPr>
-        <w:t xml:space="preserve"> </w:t>
-      </w:r>
-      <w:r>
-        <w:rPr>
-          <w:rFonts w:ascii="Arial" w:hAnsi="Arial" w:cs="Arial"/>
-          <w:bCs/>
-          <w:sz w:val="22"/>
-          <w:lang w:val="en-US"/>
-        </w:rPr>
-        <w:t>${section2</w:t>
-      </w:r>
-      <w:r>
-        <w:rPr>
-          <w:rFonts w:ascii="Arial" w:hAnsi="Arial" w:cs="Arial"/>
-          <w:bCs/>
-          <w:sz w:val="22"/>
-          <w:lang w:val="en-US"/>
-        </w:rPr>
-        <w:t>7</w:t>
-      </w:r>
-      <w:r>
-        <w:rPr>
-          <w:rFonts w:ascii="Arial" w:hAnsi="Arial" w:cs="Arial"/>
-          <w:bCs/>
-          <w:sz w:val="22"/>
-          <w:lang w:val="en-US"/>
-        </w:rPr>
-        <w:t>}</w:t>
-      </w:r>
-      <w:r>
-        <w:rPr>
-          <w:sz w:val="24"/>
-          <w:szCs w:val="24"/>
-          <w:lang w:val="es-PE"/>
-        </w:rPr>
-        <w:t xml:space="preserve"> </w:t>
-      </w:r>
-      <w:r>
-        <w:rPr>
-          <w:rFonts w:ascii="Arial" w:hAnsi="Arial" w:cs="Arial"/>
-          <w:b/>
-          <w:sz w:val="22"/>
-          <w:szCs w:val="24"/>
-          <w:u w:val="single"/>
-          <w:lang w:val="es-PE"/>
-        </w:rPr>
-        <w:t>${</w:t>
-      </w:r>
-      <w:r>
-        <w:rPr>
-          <w:rFonts w:ascii="Arial" w:hAnsi="Arial" w:cs="Arial"/>
-          <w:b/>
-          <w:sz w:val="22"/>
-          <w:szCs w:val="24"/>
           <w:u w:val="single"/>
           <w:lang w:val="es-PE"/>
         </w:rPr>
         <w:t>section28</w:t>
       </w:r>
-      <w:bookmarkStart w:id="0" w:name="_GoBack"/>
-      <w:bookmarkEnd w:id="0"/>
       <w:r>
         <w:rPr>
           <w:rFonts w:ascii="Arial" w:hAnsi="Arial" w:cs="Arial"/>

</xml_diff>